<commit_message>
Make Sigil touchscreen-only and remove sleep
</commit_message>
<xml_diff>
--- a/Documentation/User Manual/TurnHub Hardware Manual V0.21.docx
+++ b/Documentation/User Manual/TurnHub Hardware Manual V0.21.docx
@@ -2604,10 +2604,10 @@
         <ns0:rPr>
           <ns0:b/>
         </ns0:rPr>
-        <ns0:t>One unified Sigil:</ns0:t>
-      </ns0:r>
-      <ns0:r>
-        <ns0:t xml:space="preserve"> a single model with the thumbstick and light ring and a larger color screen, replacing the e-ink and OLED versions.</ns0:t>
+        <ns0:t>One touchscreen Sigil: a larger color screen with labeled touch controls, replacing the joystick, light ring, e-ink and OLED versions. The current touchscreen prototype uses the former 2.8-inch Atlas board. Hold Pair for 3 seconds, then compare the code on Atlas; Device includes touch calibration. It stays awake while powered, with no Sleep option. BOOT still provides pairing, unpair and factory reset.</ns0:t>
+      </ns0:r>
+      <ns0:r>
+        <ns0:t xml:space="preserve"/>
       </ns0:r>
     </ns0:p>
     <ns0:p>

</xml_diff>